<commit_message>
Freeze validasi KoNTekS: IRBI 2025 + unduh JSON jelas
Samakan klaim risiko ke IRBI 2025, perjelas alur workshop
(unduh JSON ke fasilitator), dan regenerate docx/xlsx.

Co-authored-by: m46d45 <m46d45@users.noreply.github.com>
</commit_message>
<xml_diff>
--- a/docs/Metodologi-PKPRB.docx
+++ b/docs/Metodologi-PKPRB.docx
@@ -5481,7 +5481,7 @@
           <w:color w:val="1F1A16"/>
           <w:sz w:val="22"/>
         </w:rPr>
-        <w:t>Komposit dikalibrasi ke angka publik IRBI 2024: Maluku 161,5; Maluku Utara 145,09; DKI Jakarta 59,29. Skor per bahaya (gempabumi, tsunami, banjir, longsor, likuefaksi, gunung api, karhutla) adalah profil relatif prototipe — bukan sel resmi IRBI/BNPB.</w:t>
+        <w:t>Komposit = indeks resmi IRBI 2025 tingkat provinsi (buku InaRISK); contoh tampilan: Papua Barat Daya 230,78; Maluku 203,94; DKI Jakarta 57,58. Per bahaya (gempabumi, tsunami, banjir, longsor, likuefaksi, gunung api, karhutla) = rata-rata sederhana skor kabupaten pada tabel ancaman IRBI yang sama — bukan angka resmi provinsi BNPB, bukan maksimum, bukan tertimbang penduduk. Provinsi tanpa baris di tabel = 0 (bukan sertifikat aman).</w:t>
       </w:r>
     </w:p>
     <w:p>
@@ -5496,7 +5496,7 @@
           <w:color w:val="1F1A16"/>
           <w:sz w:val="22"/>
         </w:rPr>
-        <w:t>Warna dan angka Risiko di peta memakai skala 1–10. Skor mentah IRBI tetap di panel.</w:t>
+        <w:t>Warna dan angka Risiko di peta memakai skala 1–10. Skor mentah tetap di panel.</w:t>
       </w:r>
     </w:p>
     <w:tbl>
@@ -5534,9 +5534,9 @@
               </w:rPr>
               <w:t>Risiko_tampil = 1 + 9 × min(1, R / R_cap)</w:t>
               <w:br/>
-              <w:t>R_cap = 100  (bahaya tunggal)</w:t>
+              <w:t>R_cap = 40   (bahaya tunggal, rata-rata kabupaten)</w:t>
               <w:br/>
-              <w:t xml:space="preserve">      = 200  (komposit)</w:t>
+              <w:t xml:space="preserve">      = 250  (komposit IRBI 2025)</w:t>
             </w:r>
           </w:p>
         </w:tc>

</xml_diff>

<commit_message>
Bedakan IABEE GA dari PA pada faktor akreditasi.
Hanya General Accreditation yang disetarakan dengan Internasional. Provisional bukan akreditasi dan memakai peringkat BAN-PT/LAM.

Co-authored-by: m46d45 <m46d45@users.noreply.github.com>
</commit_message>
<xml_diff>
--- a/docs/Metodologi-PKPRB.docx
+++ b/docs/Metodologi-PKPRB.docx
@@ -189,7 +189,7 @@
           <w:color w:val="1F1A16"/>
           <w:sz w:val="22"/>
         </w:rPr>
-        <w:t>IABEE dipetakan ke akreditasi Internasional, bukan bonus di atas Unggul. Setuju?</w:t>
+        <w:t>Hanya IABEE General Accreditation (GA) disetarakan dengan Internasional. Provisional Accreditation (PA) bukan akreditasi dan dinilai dari peringkat BAN-PT/LAM. Setuju?</w:t>
       </w:r>
     </w:p>
     <w:p>
@@ -1581,7 +1581,7 @@
           <w:color w:val="1F1A16"/>
           <w:sz w:val="22"/>
         </w:rPr>
-        <w:t>IABEE General atau Provisional → Internasional. Tidak ditumpuk di atas Unggul.</w:t>
+        <w:t>Hanya IABEE General Accreditation (GA) → Internasional, tidak ditumpuk dengan peringkat BAN-PT/LAM. Provisional Accreditation (PA) bukan akreditasi; prodi PA dinilai dari peringkat BAN-PT/LAM.</w:t>
       </w:r>
     </w:p>
     <w:tbl>
@@ -1673,7 +1673,7 @@
                 <w:color w:val="1F1A16"/>
                 <w:sz w:val="18"/>
               </w:rPr>
-              <w:t>Internasional (IABEE)</w:t>
+              <w:t>Internasional (IABEE GA)</w:t>
             </w:r>
           </w:p>
         </w:tc>

</xml_diff>

<commit_message>
P1 kuesioner KoNTekS 20: teks, matriks ponsel, kirim aman (#4)
Kuesioner workshop: teks P1, matriks ponsel, kirim idempoten, dan ekspor fasilitator.

IABEE Provisional Accreditation bukan akreditasi. Hanya General Accreditation yang disetarakan dengan Internasional.
</commit_message>
<xml_diff>
--- a/docs/Metodologi-PKPRB.docx
+++ b/docs/Metodologi-PKPRB.docx
@@ -189,7 +189,7 @@
           <w:color w:val="1F1A16"/>
           <w:sz w:val="22"/>
         </w:rPr>
-        <w:t>IABEE dipetakan ke akreditasi Internasional, bukan bonus di atas Unggul. Setuju?</w:t>
+        <w:t>Hanya IABEE General Accreditation (GA) disetarakan dengan Internasional. Provisional Accreditation (PA) bukan akreditasi dan dinilai dari peringkat BAN-PT/LAM. Setuju?</w:t>
       </w:r>
     </w:p>
     <w:p>
@@ -1581,7 +1581,7 @@
           <w:color w:val="1F1A16"/>
           <w:sz w:val="22"/>
         </w:rPr>
-        <w:t>IABEE General atau Provisional → Internasional. Tidak ditumpuk di atas Unggul.</w:t>
+        <w:t>Hanya IABEE General Accreditation (GA) → Internasional, tidak ditumpuk dengan peringkat BAN-PT/LAM. Provisional Accreditation (PA) bukan akreditasi; prodi PA dinilai dari peringkat BAN-PT/LAM.</w:t>
       </w:r>
     </w:p>
     <w:tbl>
@@ -1673,7 +1673,7 @@
                 <w:color w:val="1F1A16"/>
                 <w:sz w:val="18"/>
               </w:rPr>
-              <w:t>Internasional (IABEE)</w:t>
+              <w:t>Internasional (IABEE GA)</w:t>
             </w:r>
           </w:p>
         </w:tc>

</xml_diff>